<commit_message>
Krama Paatam upgrade and reco
</commit_message>
<xml_diff>
--- a/TS-Kramam/TS-4.1/TS 4.1 Tamil Krama Paatam Corrections.docx
+++ b/TS-Kramam/TS-4.1/TS 4.1 Tamil Krama Paatam Corrections.docx
@@ -89,10 +89,9 @@
           <w:bCs/>
           <w:sz w:val="32"/>
           <w:szCs w:val="32"/>
-          <w:highlight w:val="red"/>
           <w:u w:val="single"/>
         </w:rPr>
-        <w:t>????</w:t>
+        <w:t>30th Sep 2026</w:t>
       </w:r>
     </w:p>
     <w:p>
@@ -3228,6 +3227,156 @@
               <w:adjustRightInd w:val="0"/>
               <w:spacing w:before="0" w:line="240" w:lineRule="auto"/>
               <w:rPr>
+                <w:rFonts w:ascii="Latha" w:hAnsi="Latha" w:cs="Latha"/>
+                <w:sz w:val="28"/>
+                <w:szCs w:val="28"/>
+                <w:lang w:bidi="ta-IN"/>
+              </w:rPr>
+            </w:pPr>
+            <w:r>
+              <w:rPr>
+                <w:rFonts w:ascii="Latha" w:hAnsi="Latha" w:cs="Latha"/>
+                <w:sz w:val="28"/>
+                <w:szCs w:val="28"/>
+                <w:cs/>
+                <w:lang w:bidi="ta-IN"/>
+              </w:rPr>
+              <w:t>வி</w:t>
+            </w:r>
+            <w:r>
+              <w:rPr>
+                <w:rFonts w:ascii="BRH Tamil Tab Extra" w:hAnsi="BRH Tamil Tab Extra" w:cs="Latha"/>
+                <w:b/>
+                <w:sz w:val="36"/>
+                <w:szCs w:val="28"/>
+                <w:lang w:bidi="ta-IN"/>
+              </w:rPr>
+              <w:t>…</w:t>
+            </w:r>
+            <w:r>
+              <w:rPr>
+                <w:rFonts w:ascii="Latha" w:hAnsi="Latha" w:cs="Latha"/>
+                <w:sz w:val="28"/>
+                <w:szCs w:val="28"/>
+                <w:cs/>
+                <w:lang w:bidi="ta-IN"/>
+              </w:rPr>
+              <w:t>தே</w:t>
+            </w:r>
+            <w:r>
+              <w:rPr>
+                <w:rFonts w:ascii="BRH Tamil Tab Extra" w:hAnsi="BRH Tamil Tab Extra" w:cs="Latha"/>
+                <w:b/>
+                <w:sz w:val="36"/>
+                <w:szCs w:val="28"/>
+                <w:lang w:bidi="ta-IN"/>
+              </w:rPr>
+              <w:t>…</w:t>
+            </w:r>
+            <w:r>
+              <w:rPr>
+                <w:rFonts w:ascii="Latha" w:hAnsi="Latha" w:cs="Latha"/>
+                <w:b/>
+                <w:bCs/>
+                <w:position w:val="-12"/>
+                <w:sz w:val="28"/>
+                <w:szCs w:val="28"/>
+                <w:cs/>
+                <w:lang w:bidi="ta-IN"/>
+              </w:rPr>
+              <w:t>4</w:t>
+            </w:r>
+            <w:r>
+              <w:rPr>
+                <w:rFonts w:ascii="Latha" w:hAnsi="Latha" w:cs="Latha"/>
+                <w:sz w:val="28"/>
+                <w:szCs w:val="28"/>
+                <w:highlight w:val="green"/>
+                <w:cs/>
+                <w:lang w:bidi="ta-IN"/>
+              </w:rPr>
+              <w:t>மே</w:t>
+            </w:r>
+            <w:r>
+              <w:rPr>
+                <w:rFonts w:ascii="Latha" w:hAnsi="Latha" w:cs="Latha"/>
+                <w:sz w:val="28"/>
+                <w:szCs w:val="28"/>
+                <w:cs/>
+                <w:lang w:bidi="ta-IN"/>
+              </w:rPr>
+              <w:t>தி</w:t>
+            </w:r>
+            <w:r>
+              <w:rPr>
+                <w:rFonts w:ascii="BRH Tamil Tab Extra" w:hAnsi="BRH Tamil Tab Extra" w:cs="Latha"/>
+                <w:b/>
+                <w:sz w:val="36"/>
+                <w:szCs w:val="28"/>
+                <w:lang w:bidi="ta-IN"/>
+              </w:rPr>
+              <w:t>†</w:t>
+            </w:r>
+            <w:r>
+              <w:rPr>
+                <w:rFonts w:ascii="Latha" w:hAnsi="Latha" w:cs="Latha"/>
+                <w:sz w:val="28"/>
+                <w:szCs w:val="28"/>
+                <w:lang w:bidi="ta-IN"/>
+              </w:rPr>
+              <w:t xml:space="preserve"> </w:t>
+            </w:r>
+            <w:r>
+              <w:rPr>
+                <w:rFonts w:ascii="Latha" w:hAnsi="Latha" w:cs="Latha"/>
+                <w:sz w:val="28"/>
+                <w:szCs w:val="28"/>
+                <w:cs/>
+                <w:lang w:bidi="ta-IN"/>
+              </w:rPr>
+              <w:t>விதே</w:t>
+            </w:r>
+            <w:r>
+              <w:rPr>
+                <w:rFonts w:ascii="Latha" w:hAnsi="Latha" w:cs="Latha"/>
+                <w:b/>
+                <w:bCs/>
+                <w:position w:val="-12"/>
+                <w:sz w:val="28"/>
+                <w:szCs w:val="28"/>
+                <w:cs/>
+                <w:lang w:bidi="ta-IN"/>
+              </w:rPr>
+              <w:t>4</w:t>
+            </w:r>
+            <w:r>
+              <w:rPr>
+                <w:rFonts w:ascii="Latha" w:hAnsi="Latha" w:cs="Latha"/>
+                <w:sz w:val="28"/>
+                <w:szCs w:val="28"/>
+                <w:cs/>
+                <w:lang w:bidi="ta-IN"/>
+              </w:rPr>
+              <w:t>ம</w:t>
+            </w:r>
+            <w:r>
+              <w:rPr>
+                <w:rFonts w:ascii="Latha" w:hAnsi="Latha" w:cs="Latha"/>
+                <w:sz w:val="28"/>
+                <w:szCs w:val="28"/>
+                <w:lang w:bidi="ta-IN"/>
+              </w:rPr>
+              <w:t xml:space="preserve"> ||</w:t>
+            </w:r>
+          </w:p>
+          <w:p>
+            <w:pPr>
+              <w:widowControl w:val="0"/>
+              <w:autoSpaceDE w:val="0"/>
+              <w:autoSpaceDN w:val="0"/>
+              <w:adjustRightInd w:val="0"/>
+              <w:spacing w:before="0" w:line="240" w:lineRule="auto"/>
+              <w:rPr>
                 <w:rFonts w:ascii="BRH Malayalam Extra" w:eastAsia="Times New Roman" w:hAnsi="BRH Malayalam Extra" w:cs="BRH Malayalam Extra"/>
                 <w:color w:val="000000"/>
                 <w:sz w:val="40"/>
@@ -3235,141 +3384,6 @@
                 <w:lang w:val="en-IN" w:eastAsia="en-IN" w:bidi="ml-IN"/>
               </w:rPr>
             </w:pPr>
-            <w:r>
-              <w:rPr>
-                <w:rFonts w:ascii="Latha" w:hAnsi="Latha" w:cs="Latha"/>
-                <w:sz w:val="28"/>
-                <w:szCs w:val="28"/>
-                <w:cs/>
-                <w:lang w:bidi="ta-IN"/>
-              </w:rPr>
-              <w:t>வி</w:t>
-            </w:r>
-            <w:r>
-              <w:rPr>
-                <w:rFonts w:ascii="BRH Tamil Tab Extra" w:hAnsi="BRH Tamil Tab Extra" w:cs="Latha"/>
-                <w:b/>
-                <w:sz w:val="36"/>
-                <w:szCs w:val="28"/>
-                <w:lang w:bidi="ta-IN"/>
-              </w:rPr>
-              <w:t>…</w:t>
-            </w:r>
-            <w:r>
-              <w:rPr>
-                <w:rFonts w:ascii="Latha" w:hAnsi="Latha" w:cs="Latha"/>
-                <w:sz w:val="28"/>
-                <w:szCs w:val="28"/>
-                <w:cs/>
-                <w:lang w:bidi="ta-IN"/>
-              </w:rPr>
-              <w:t>தே</w:t>
-            </w:r>
-            <w:r>
-              <w:rPr>
-                <w:rFonts w:ascii="BRH Tamil Tab Extra" w:hAnsi="BRH Tamil Tab Extra" w:cs="Latha"/>
-                <w:b/>
-                <w:sz w:val="36"/>
-                <w:szCs w:val="28"/>
-                <w:lang w:bidi="ta-IN"/>
-              </w:rPr>
-              <w:t>…</w:t>
-            </w:r>
-            <w:r>
-              <w:rPr>
-                <w:rFonts w:ascii="Latha" w:hAnsi="Latha" w:cs="Latha"/>
-                <w:b/>
-                <w:bCs/>
-                <w:position w:val="-12"/>
-                <w:sz w:val="28"/>
-                <w:szCs w:val="28"/>
-                <w:cs/>
-                <w:lang w:bidi="ta-IN"/>
-              </w:rPr>
-              <w:t>4</w:t>
-            </w:r>
-            <w:r>
-              <w:rPr>
-                <w:rFonts w:ascii="Latha" w:hAnsi="Latha" w:cs="Latha"/>
-                <w:sz w:val="28"/>
-                <w:szCs w:val="28"/>
-                <w:highlight w:val="green"/>
-                <w:cs/>
-                <w:lang w:bidi="ta-IN"/>
-              </w:rPr>
-              <w:t>மே</w:t>
-            </w:r>
-            <w:r>
-              <w:rPr>
-                <w:rFonts w:ascii="Latha" w:hAnsi="Latha" w:cs="Latha"/>
-                <w:sz w:val="28"/>
-                <w:szCs w:val="28"/>
-                <w:cs/>
-                <w:lang w:bidi="ta-IN"/>
-              </w:rPr>
-              <w:t>தி</w:t>
-            </w:r>
-            <w:r>
-              <w:rPr>
-                <w:rFonts w:ascii="BRH Tamil Tab Extra" w:hAnsi="BRH Tamil Tab Extra" w:cs="Latha"/>
-                <w:b/>
-                <w:sz w:val="36"/>
-                <w:szCs w:val="28"/>
-                <w:lang w:bidi="ta-IN"/>
-              </w:rPr>
-              <w:t>†</w:t>
-            </w:r>
-            <w:r>
-              <w:rPr>
-                <w:rFonts w:ascii="Latha" w:hAnsi="Latha" w:cs="Latha"/>
-                <w:sz w:val="28"/>
-                <w:szCs w:val="28"/>
-                <w:lang w:bidi="ta-IN"/>
-              </w:rPr>
-              <w:t xml:space="preserve"> </w:t>
-            </w:r>
-            <w:r>
-              <w:rPr>
-                <w:rFonts w:ascii="Latha" w:hAnsi="Latha" w:cs="Latha"/>
-                <w:sz w:val="28"/>
-                <w:szCs w:val="28"/>
-                <w:cs/>
-                <w:lang w:bidi="ta-IN"/>
-              </w:rPr>
-              <w:t>விதே</w:t>
-            </w:r>
-            <w:r>
-              <w:rPr>
-                <w:rFonts w:ascii="Latha" w:hAnsi="Latha" w:cs="Latha"/>
-                <w:b/>
-                <w:bCs/>
-                <w:position w:val="-12"/>
-                <w:sz w:val="28"/>
-                <w:szCs w:val="28"/>
-                <w:cs/>
-                <w:lang w:bidi="ta-IN"/>
-              </w:rPr>
-              <w:t>4</w:t>
-            </w:r>
-            <w:r>
-              <w:rPr>
-                <w:rFonts w:ascii="Latha" w:hAnsi="Latha" w:cs="Latha"/>
-                <w:sz w:val="28"/>
-                <w:szCs w:val="28"/>
-                <w:cs/>
-                <w:lang w:bidi="ta-IN"/>
-              </w:rPr>
-              <w:t>ம</w:t>
-            </w:r>
-            <w:r>
-              <w:rPr>
-                <w:rFonts w:ascii="Latha" w:hAnsi="Latha" w:cs="Latha"/>
-                <w:sz w:val="28"/>
-                <w:szCs w:val="28"/>
-                <w:lang w:bidi="ta-IN"/>
-              </w:rPr>
-              <w:t xml:space="preserve"> ||</w:t>
-            </w:r>
           </w:p>
         </w:tc>
       </w:tr>
@@ -3412,6 +3426,7 @@
                 <w:sz w:val="28"/>
                 <w:szCs w:val="32"/>
               </w:rPr>
+              <w:lastRenderedPageBreak/>
               <w:t>T.S.4.1.</w:t>
             </w:r>
             <w:r>
@@ -3499,7 +3514,6 @@
                 <w:szCs w:val="32"/>
                 <w:lang w:val="it-IT"/>
               </w:rPr>
-              <w:lastRenderedPageBreak/>
               <w:t>Panchaati No</w:t>
             </w:r>
             <w:r>
@@ -3556,7 +3570,6 @@
                 <w:cs/>
                 <w:lang w:bidi="ta-IN"/>
               </w:rPr>
-              <w:lastRenderedPageBreak/>
               <w:t>த்வம்</w:t>
             </w:r>
             <w:r>
@@ -3650,7 +3663,6 @@
                 <w:cs/>
                 <w:lang w:bidi="ta-IN"/>
               </w:rPr>
-              <w:lastRenderedPageBreak/>
               <w:t>கா</w:t>
             </w:r>
             <w:r>
@@ -3834,7 +3846,6 @@
                 <w:cs/>
                 <w:lang w:bidi="ta-IN"/>
               </w:rPr>
-              <w:lastRenderedPageBreak/>
               <w:t>த்வம்</w:t>
             </w:r>
             <w:r>
@@ -3929,7 +3940,6 @@
                 <w:cs/>
                 <w:lang w:bidi="ta-IN"/>
               </w:rPr>
-              <w:lastRenderedPageBreak/>
               <w:t>கா</w:t>
             </w:r>
             <w:r>
@@ -4097,10 +4107,7 @@
           <w:u w:val="single"/>
         </w:rPr>
       </w:pPr>
-    </w:p>
-    <w:p>
-      <w:pPr>
-        <w:jc w:val="center"/>
+      <w:r>
         <w:rPr>
           <w:b/>
           <w:bCs/>
@@ -4108,7 +4115,8 @@
           <w:szCs w:val="32"/>
           <w:u w:val="single"/>
         </w:rPr>
-      </w:pPr>
+        <w:t>==========================</w:t>
+      </w:r>
     </w:p>
     <w:p>
       <w:pPr>
@@ -7646,42 +7654,6 @@
           <w:u w:val="single"/>
         </w:rPr>
       </w:pPr>
-    </w:p>
-    <w:p>
-      <w:pPr>
-        <w:jc w:val="center"/>
-        <w:rPr>
-          <w:b/>
-          <w:bCs/>
-          <w:sz w:val="32"/>
-          <w:szCs w:val="32"/>
-          <w:u w:val="single"/>
-        </w:rPr>
-      </w:pPr>
-    </w:p>
-    <w:p>
-      <w:pPr>
-        <w:jc w:val="center"/>
-        <w:rPr>
-          <w:b/>
-          <w:bCs/>
-          <w:sz w:val="32"/>
-          <w:szCs w:val="32"/>
-          <w:u w:val="single"/>
-        </w:rPr>
-      </w:pPr>
-    </w:p>
-    <w:p>
-      <w:pPr>
-        <w:jc w:val="center"/>
-        <w:rPr>
-          <w:b/>
-          <w:bCs/>
-          <w:sz w:val="32"/>
-          <w:szCs w:val="32"/>
-          <w:u w:val="single"/>
-        </w:rPr>
-      </w:pPr>
       <w:r>
         <w:rPr>
           <w:b/>
@@ -7760,7 +7732,29 @@
           <w:szCs w:val="32"/>
           <w:u w:val="single"/>
         </w:rPr>
-        <w:t>31st  Oct 2021</w:t>
+        <w:t>31</w:t>
+      </w:r>
+      <w:proofErr w:type="gramStart"/>
+      <w:r>
+        <w:rPr>
+          <w:b/>
+          <w:bCs/>
+          <w:sz w:val="32"/>
+          <w:szCs w:val="32"/>
+          <w:u w:val="single"/>
+        </w:rPr>
+        <w:t>st  Oct</w:t>
+      </w:r>
+      <w:proofErr w:type="gramEnd"/>
+      <w:r>
+        <w:rPr>
+          <w:b/>
+          <w:bCs/>
+          <w:sz w:val="32"/>
+          <w:szCs w:val="32"/>
+          <w:u w:val="single"/>
+        </w:rPr>
+        <w:t xml:space="preserve"> 2021</w:t>
       </w:r>
     </w:p>
     <w:p>
@@ -9512,7 +9506,6 @@
                 <w:sz w:val="28"/>
                 <w:szCs w:val="32"/>
               </w:rPr>
-              <w:lastRenderedPageBreak/>
               <w:t>Panchaati No</w:t>
             </w:r>
             <w:r>
@@ -9560,7 +9553,6 @@
                 <w:cs/>
                 <w:lang w:bidi="ta-IN"/>
               </w:rPr>
-              <w:lastRenderedPageBreak/>
               <w:t>உ</w:t>
             </w:r>
             <w:r>
@@ -10361,6 +10353,7 @@
                 <w:sz w:val="28"/>
                 <w:szCs w:val="32"/>
               </w:rPr>
+              <w:lastRenderedPageBreak/>
               <w:t>T.S.4.1.7.3 – Kramam</w:t>
             </w:r>
           </w:p>
@@ -13089,7 +13082,6 @@
                 <w:sz w:val="28"/>
                 <w:szCs w:val="32"/>
               </w:rPr>
-              <w:lastRenderedPageBreak/>
               <w:t>T.S.4.1.9.2 – Kramam</w:t>
             </w:r>
           </w:p>
@@ -13939,6 +13931,7 @@
           <w:szCs w:val="40"/>
           <w:lang w:val="en-IN" w:eastAsia="en-IN"/>
         </w:rPr>
+        <w:lastRenderedPageBreak/>
         <w:t>"</w:t>
       </w:r>
       <w:r>
@@ -13983,7 +13976,16 @@
           <w:bCs/>
           <w:sz w:val="32"/>
         </w:rPr>
-        <w:t>replaced with</w:t>
+        <w:t xml:space="preserve">replaced </w:t>
+      </w:r>
+      <w:proofErr w:type="gramStart"/>
+      <w:r>
+        <w:rPr>
+          <w:b/>
+          <w:bCs/>
+          <w:sz w:val="32"/>
+        </w:rPr>
+        <w:t>with</w:t>
       </w:r>
       <w:r>
         <w:rPr>
@@ -14005,6 +14007,7 @@
         </w:rPr>
         <w:t>"</w:t>
       </w:r>
+      <w:proofErr w:type="gramEnd"/>
       <w:r>
         <w:rPr>
           <w:rFonts w:ascii="Latha" w:hAnsi="Latha" w:cs="Latha"/>

</xml_diff>